<commit_message>
modifs prod backlog + perturbations j3
</commit_message>
<xml_diff>
--- a/docs/perturbations/j1/product-backlog.docx
+++ b/docs/perturbations/j1/product-backlog.docx
@@ -10669,14 +10669,7 @@
                 <w:color w:val="1E1B4B"/>
                 <w:sz w:val="18"/>
               </w:rPr>
-              <w:t>En tant que Mme Lefèvre</w:t>
-            </w:r>
-            <w:r>
-              <w:rPr>
-                <w:color w:val="1E1B4B"/>
-                <w:sz w:val="18"/>
-              </w:rPr>
-              <w:t xml:space="preserve"> je souhaite voir les résultats de ma classe pour un quiz, afin d’identifier les notions non comprises</w:t>
+              <w:t>En tant que Mme Lefèvre je souhaite voir les résultats de ma classe pour un quiz, afin d’identifier les notions non comprises</w:t>
             </w:r>
           </w:p>
         </w:tc>
@@ -10687,7 +10680,6 @@
           <w:p>
             <w:pPr>
               <w:pStyle w:val="TableParagraph"/>
-              <w:jc w:val="center"/>
               <w:rPr>
                 <w:iCs/>
                 <w:color w:val="1E1B4B"/>
@@ -10850,14 +10842,7 @@
                 <w:color w:val="1E1B4B"/>
                 <w:sz w:val="18"/>
               </w:rPr>
-              <w:t>En tant que Mme Lefèvre</w:t>
-            </w:r>
-            <w:r>
-              <w:rPr>
-                <w:color w:val="1E1B4B"/>
-                <w:sz w:val="18"/>
-              </w:rPr>
-              <w:t>, je veux que les réponses des élèves soient corrigées automatiquement, afin de gagner du temps de correction</w:t>
+              <w:t>En tant que Mme Lefèvre, je veux que les réponses des élèves soient corrigées automatiquement, afin de gagner du temps de correction</w:t>
             </w:r>
           </w:p>
         </w:tc>
@@ -10960,6 +10945,757 @@
                 <w:sz w:val="18"/>
               </w:rPr>
               <w:t>8</w:t>
+            </w:r>
+          </w:p>
+        </w:tc>
+      </w:tr>
+      <w:tr>
+        <w:trPr>
+          <w:trHeight w:val="1319"/>
+        </w:trPr>
+        <w:tc>
+          <w:tcPr>
+            <w:tcW w:w="883" w:type="dxa"/>
+          </w:tcPr>
+          <w:p>
+            <w:pPr>
+              <w:pStyle w:val="TableParagraph"/>
+              <w:ind w:left="37"/>
+              <w:rPr>
+                <w:b/>
+                <w:color w:val="1E1B4B"/>
+                <w:spacing w:val="-2"/>
+                <w:sz w:val="20"/>
+              </w:rPr>
+            </w:pPr>
+            <w:r>
+              <w:rPr>
+                <w:b/>
+                <w:color w:val="1E1B4B"/>
+                <w:spacing w:val="-2"/>
+                <w:sz w:val="20"/>
+              </w:rPr>
+              <w:t>US-24</w:t>
+            </w:r>
+          </w:p>
+        </w:tc>
+        <w:tc>
+          <w:tcPr>
+            <w:tcW w:w="883" w:type="dxa"/>
+          </w:tcPr>
+          <w:p>
+            <w:pPr>
+              <w:pStyle w:val="TableParagraph"/>
+              <w:rPr>
+                <w:color w:val="1E1B4B"/>
+                <w:sz w:val="18"/>
+              </w:rPr>
+            </w:pPr>
+            <w:r>
+              <w:rPr>
+                <w:color w:val="1E1B4B"/>
+                <w:sz w:val="18"/>
+              </w:rPr>
+              <w:t>EP-03</w:t>
+            </w:r>
+          </w:p>
+        </w:tc>
+        <w:tc>
+          <w:tcPr>
+            <w:tcW w:w="4195" w:type="dxa"/>
+          </w:tcPr>
+          <w:p>
+            <w:pPr>
+              <w:pStyle w:val="TableParagraph"/>
+              <w:spacing w:line="261" w:lineRule="auto"/>
+              <w:ind w:right="173"/>
+              <w:rPr>
+                <w:color w:val="1E1B4B"/>
+                <w:sz w:val="18"/>
+              </w:rPr>
+            </w:pPr>
+            <w:r>
+              <w:rPr>
+                <w:color w:val="1E1B4B"/>
+                <w:sz w:val="18"/>
+              </w:rPr>
+              <w:t>En tant qu'étudiant, je veux que le contenu de mon cours soit traité uniquement comme une source d'information et non comme une instruction pour le modèle d'IA, afin que les quiz générés ne puissent pas être manipulés par une Prompt Injection.</w:t>
+            </w:r>
+          </w:p>
+        </w:tc>
+        <w:tc>
+          <w:tcPr>
+            <w:tcW w:w="1435" w:type="dxa"/>
+          </w:tcPr>
+          <w:p>
+            <w:pPr>
+              <w:pStyle w:val="TableParagraph"/>
+              <w:rPr>
+                <w:color w:val="1E1B4B"/>
+                <w:spacing w:val="-2"/>
+                <w:sz w:val="18"/>
+              </w:rPr>
+            </w:pPr>
+            <w:r>
+              <w:rPr>
+                <w:color w:val="1E1B4B"/>
+                <w:spacing w:val="-2"/>
+                <w:sz w:val="18"/>
+              </w:rPr>
+              <w:t>Etudiant</w:t>
+            </w:r>
+          </w:p>
+        </w:tc>
+        <w:tc>
+          <w:tcPr>
+            <w:tcW w:w="993" w:type="dxa"/>
+            <w:shd w:val="clear" w:color="auto" w:fill="C00000"/>
+          </w:tcPr>
+          <w:p>
+            <w:pPr>
+              <w:pStyle w:val="TableParagraph"/>
+              <w:spacing w:before="50"/>
+              <w:ind w:left="0"/>
+              <w:rPr>
+                <w:b/>
+                <w:color w:val="DC2626"/>
+                <w:spacing w:val="-4"/>
+                <w:sz w:val="20"/>
+              </w:rPr>
+            </w:pPr>
+            <w:r>
+              <w:rPr>
+                <w:b/>
+                <w:color w:val="DC2626"/>
+                <w:spacing w:val="-4"/>
+                <w:sz w:val="20"/>
+              </w:rPr>
+              <w:t xml:space="preserve"> </w:t>
+            </w:r>
+          </w:p>
+          <w:p>
+            <w:pPr>
+              <w:pStyle w:val="TableParagraph"/>
+              <w:spacing w:before="50"/>
+              <w:ind w:left="0"/>
+              <w:rPr>
+                <w:b/>
+                <w:color w:val="DC2626"/>
+                <w:spacing w:val="-4"/>
+                <w:sz w:val="20"/>
+              </w:rPr>
+            </w:pPr>
+            <w:r>
+              <w:rPr>
+                <w:b/>
+                <w:color w:val="DC2626"/>
+                <w:spacing w:val="-4"/>
+                <w:sz w:val="20"/>
+              </w:rPr>
+              <w:t xml:space="preserve">     </w:t>
+            </w:r>
+          </w:p>
+          <w:p>
+            <w:pPr>
+              <w:pStyle w:val="TableParagraph"/>
+              <w:spacing w:before="50"/>
+              <w:ind w:left="0"/>
+              <w:rPr>
+                <w:i/>
+                <w:sz w:val="20"/>
+              </w:rPr>
+            </w:pPr>
+            <w:r>
+              <w:rPr>
+                <w:b/>
+                <w:color w:val="DC2626"/>
+                <w:spacing w:val="-4"/>
+                <w:sz w:val="20"/>
+              </w:rPr>
+              <w:t xml:space="preserve">      </w:t>
+            </w:r>
+            <w:r>
+              <w:rPr>
+                <w:b/>
+                <w:color w:val="DC2626"/>
+                <w:spacing w:val="-4"/>
+                <w:sz w:val="20"/>
+              </w:rPr>
+              <w:t>MUST</w:t>
+            </w:r>
+          </w:p>
+        </w:tc>
+        <w:tc>
+          <w:tcPr>
+            <w:tcW w:w="662" w:type="dxa"/>
+          </w:tcPr>
+          <w:p>
+            <w:pPr>
+              <w:pStyle w:val="TableParagraph"/>
+              <w:ind w:left="0" w:right="4"/>
+              <w:jc w:val="right"/>
+              <w:rPr>
+                <w:color w:val="1E1B4B"/>
+                <w:spacing w:val="-5"/>
+                <w:sz w:val="18"/>
+              </w:rPr>
+            </w:pPr>
+            <w:r>
+              <w:rPr>
+                <w:color w:val="1E1B4B"/>
+                <w:spacing w:val="-5"/>
+                <w:sz w:val="18"/>
+              </w:rPr>
+              <w:t>5</w:t>
+            </w:r>
+          </w:p>
+        </w:tc>
+      </w:tr>
+      <w:tr>
+        <w:trPr>
+          <w:trHeight w:val="1319"/>
+        </w:trPr>
+        <w:tc>
+          <w:tcPr>
+            <w:tcW w:w="883" w:type="dxa"/>
+          </w:tcPr>
+          <w:p>
+            <w:pPr>
+              <w:pStyle w:val="TableParagraph"/>
+              <w:ind w:left="37"/>
+              <w:rPr>
+                <w:b/>
+                <w:color w:val="1E1B4B"/>
+                <w:spacing w:val="-2"/>
+                <w:sz w:val="20"/>
+              </w:rPr>
+            </w:pPr>
+            <w:r>
+              <w:rPr>
+                <w:b/>
+                <w:color w:val="1E1B4B"/>
+                <w:spacing w:val="-2"/>
+                <w:sz w:val="20"/>
+              </w:rPr>
+              <w:t>US-25</w:t>
+            </w:r>
+          </w:p>
+        </w:tc>
+        <w:tc>
+          <w:tcPr>
+            <w:tcW w:w="883" w:type="dxa"/>
+          </w:tcPr>
+          <w:p>
+            <w:pPr>
+              <w:pStyle w:val="TableParagraph"/>
+              <w:rPr>
+                <w:color w:val="1E1B4B"/>
+                <w:sz w:val="18"/>
+              </w:rPr>
+            </w:pPr>
+            <w:r>
+              <w:rPr>
+                <w:color w:val="1E1B4B"/>
+                <w:sz w:val="18"/>
+              </w:rPr>
+              <w:t>EP-03</w:t>
+            </w:r>
+          </w:p>
+        </w:tc>
+        <w:tc>
+          <w:tcPr>
+            <w:tcW w:w="4195" w:type="dxa"/>
+          </w:tcPr>
+          <w:p>
+            <w:pPr>
+              <w:pStyle w:val="TableParagraph"/>
+              <w:spacing w:line="261" w:lineRule="auto"/>
+              <w:ind w:right="173"/>
+              <w:rPr>
+                <w:color w:val="1E1B4B"/>
+                <w:sz w:val="18"/>
+              </w:rPr>
+            </w:pPr>
+            <w:r>
+              <w:rPr>
+                <w:color w:val="1E1B4B"/>
+                <w:sz w:val="18"/>
+              </w:rPr>
+              <w:t>En tant qu'</w:t>
+            </w:r>
+            <w:proofErr w:type="spellStart"/>
+            <w:r>
+              <w:rPr>
+                <w:color w:val="1E1B4B"/>
+                <w:sz w:val="18"/>
+              </w:rPr>
+              <w:t>utilisateur·trice</w:t>
+            </w:r>
+            <w:proofErr w:type="spellEnd"/>
+            <w:r>
+              <w:rPr>
+                <w:color w:val="1E1B4B"/>
+                <w:sz w:val="18"/>
+              </w:rPr>
+              <w:t>, je veux que chaque quiz généré soit automatiquement validé avant d'être affiché, afin de garantir un format correct et fiable.</w:t>
+            </w:r>
+          </w:p>
+        </w:tc>
+        <w:tc>
+          <w:tcPr>
+            <w:tcW w:w="1435" w:type="dxa"/>
+          </w:tcPr>
+          <w:p>
+            <w:pPr>
+              <w:pStyle w:val="TableParagraph"/>
+              <w:rPr>
+                <w:color w:val="1E1B4B"/>
+                <w:spacing w:val="-2"/>
+                <w:sz w:val="18"/>
+              </w:rPr>
+            </w:pPr>
+            <w:r>
+              <w:rPr>
+                <w:color w:val="1E1B4B"/>
+                <w:spacing w:val="-2"/>
+                <w:sz w:val="18"/>
+              </w:rPr>
+              <w:t xml:space="preserve">Tous les </w:t>
+            </w:r>
+            <w:proofErr w:type="spellStart"/>
+            <w:r>
+              <w:rPr>
+                <w:color w:val="1E1B4B"/>
+                <w:spacing w:val="-2"/>
+                <w:sz w:val="18"/>
+              </w:rPr>
+              <w:t>personas</w:t>
+            </w:r>
+            <w:proofErr w:type="spellEnd"/>
+          </w:p>
+        </w:tc>
+        <w:tc>
+          <w:tcPr>
+            <w:tcW w:w="993" w:type="dxa"/>
+            <w:shd w:val="clear" w:color="auto" w:fill="C00000"/>
+          </w:tcPr>
+          <w:p>
+            <w:pPr>
+              <w:pStyle w:val="TableParagraph"/>
+              <w:spacing w:before="50"/>
+              <w:ind w:left="0"/>
+              <w:rPr>
+                <w:b/>
+                <w:color w:val="DC2626"/>
+                <w:spacing w:val="-4"/>
+                <w:sz w:val="20"/>
+              </w:rPr>
+            </w:pPr>
+            <w:r>
+              <w:rPr>
+                <w:b/>
+                <w:color w:val="DC2626"/>
+                <w:spacing w:val="-4"/>
+                <w:sz w:val="20"/>
+              </w:rPr>
+              <w:t xml:space="preserve">    </w:t>
+            </w:r>
+          </w:p>
+          <w:p>
+            <w:pPr>
+              <w:pStyle w:val="TableParagraph"/>
+              <w:spacing w:before="50"/>
+              <w:ind w:left="0"/>
+              <w:rPr>
+                <w:i/>
+                <w:sz w:val="20"/>
+              </w:rPr>
+            </w:pPr>
+            <w:r>
+              <w:rPr>
+                <w:b/>
+                <w:color w:val="DC2626"/>
+                <w:spacing w:val="-4"/>
+                <w:sz w:val="20"/>
+              </w:rPr>
+              <w:t xml:space="preserve">     </w:t>
+            </w:r>
+            <w:r>
+              <w:rPr>
+                <w:b/>
+                <w:color w:val="DC2626"/>
+                <w:spacing w:val="-4"/>
+                <w:sz w:val="20"/>
+              </w:rPr>
+              <w:t>MUST</w:t>
+            </w:r>
+          </w:p>
+        </w:tc>
+        <w:tc>
+          <w:tcPr>
+            <w:tcW w:w="662" w:type="dxa"/>
+          </w:tcPr>
+          <w:p>
+            <w:pPr>
+              <w:pStyle w:val="TableParagraph"/>
+              <w:ind w:left="0" w:right="4"/>
+              <w:jc w:val="right"/>
+              <w:rPr>
+                <w:color w:val="1E1B4B"/>
+                <w:spacing w:val="-5"/>
+                <w:sz w:val="18"/>
+              </w:rPr>
+            </w:pPr>
+            <w:r>
+              <w:rPr>
+                <w:color w:val="1E1B4B"/>
+                <w:spacing w:val="-5"/>
+                <w:sz w:val="18"/>
+              </w:rPr>
+              <w:t>3</w:t>
+            </w:r>
+          </w:p>
+        </w:tc>
+      </w:tr>
+      <w:tr>
+        <w:trPr>
+          <w:trHeight w:val="1319"/>
+        </w:trPr>
+        <w:tc>
+          <w:tcPr>
+            <w:tcW w:w="883" w:type="dxa"/>
+          </w:tcPr>
+          <w:p>
+            <w:pPr>
+              <w:pStyle w:val="TableParagraph"/>
+              <w:ind w:left="37"/>
+              <w:rPr>
+                <w:b/>
+                <w:color w:val="1E1B4B"/>
+                <w:spacing w:val="-2"/>
+                <w:sz w:val="20"/>
+              </w:rPr>
+            </w:pPr>
+            <w:r>
+              <w:rPr>
+                <w:b/>
+                <w:color w:val="1E1B4B"/>
+                <w:spacing w:val="-2"/>
+                <w:sz w:val="20"/>
+              </w:rPr>
+              <w:t>US-26</w:t>
+            </w:r>
+          </w:p>
+        </w:tc>
+        <w:tc>
+          <w:tcPr>
+            <w:tcW w:w="883" w:type="dxa"/>
+          </w:tcPr>
+          <w:p>
+            <w:pPr>
+              <w:pStyle w:val="TableParagraph"/>
+              <w:rPr>
+                <w:color w:val="1E1B4B"/>
+                <w:sz w:val="18"/>
+              </w:rPr>
+            </w:pPr>
+            <w:r>
+              <w:rPr>
+                <w:color w:val="1E1B4B"/>
+                <w:sz w:val="18"/>
+              </w:rPr>
+              <w:t>EP-06</w:t>
+            </w:r>
+          </w:p>
+        </w:tc>
+        <w:tc>
+          <w:tcPr>
+            <w:tcW w:w="4195" w:type="dxa"/>
+          </w:tcPr>
+          <w:p>
+            <w:pPr>
+              <w:pStyle w:val="TableParagraph"/>
+              <w:spacing w:line="261" w:lineRule="auto"/>
+              <w:ind w:right="173"/>
+              <w:rPr>
+                <w:color w:val="1E1B4B"/>
+                <w:sz w:val="18"/>
+              </w:rPr>
+            </w:pPr>
+            <w:r>
+              <w:rPr>
+                <w:color w:val="1E1B4B"/>
+                <w:sz w:val="18"/>
+              </w:rPr>
+              <w:t xml:space="preserve">En tant que développeur, je veux qu'un jeu de tests </w:t>
+            </w:r>
+            <w:proofErr w:type="spellStart"/>
+            <w:r>
+              <w:rPr>
+                <w:color w:val="1E1B4B"/>
+                <w:sz w:val="18"/>
+              </w:rPr>
+              <w:t>adversariaux</w:t>
+            </w:r>
+            <w:proofErr w:type="spellEnd"/>
+            <w:r>
+              <w:rPr>
+                <w:color w:val="1E1B4B"/>
+                <w:sz w:val="18"/>
+              </w:rPr>
+              <w:t xml:space="preserve"> soit exécuté automatiquement dans </w:t>
+            </w:r>
+            <w:proofErr w:type="gramStart"/>
+            <w:r>
+              <w:rPr>
+                <w:color w:val="1E1B4B"/>
+                <w:sz w:val="18"/>
+              </w:rPr>
+              <w:t>la pipeline</w:t>
+            </w:r>
+            <w:proofErr w:type="gramEnd"/>
+            <w:r>
+              <w:rPr>
+                <w:color w:val="1E1B4B"/>
+                <w:sz w:val="18"/>
+              </w:rPr>
+              <w:t xml:space="preserve"> CI à chaque Push ou Pull </w:t>
+            </w:r>
+            <w:proofErr w:type="spellStart"/>
+            <w:r>
+              <w:rPr>
+                <w:color w:val="1E1B4B"/>
+                <w:sz w:val="18"/>
+              </w:rPr>
+              <w:t>Request</w:t>
+            </w:r>
+            <w:proofErr w:type="spellEnd"/>
+            <w:r>
+              <w:rPr>
+                <w:color w:val="1E1B4B"/>
+                <w:sz w:val="18"/>
+              </w:rPr>
+              <w:t>, afin de détecter toute régression de sécurité avant la mise en production.</w:t>
+            </w:r>
+          </w:p>
+        </w:tc>
+        <w:tc>
+          <w:tcPr>
+            <w:tcW w:w="1435" w:type="dxa"/>
+          </w:tcPr>
+          <w:p>
+            <w:pPr>
+              <w:pStyle w:val="TableParagraph"/>
+              <w:rPr>
+                <w:color w:val="1E1B4B"/>
+                <w:spacing w:val="-2"/>
+                <w:sz w:val="18"/>
+              </w:rPr>
+            </w:pPr>
+            <w:r>
+              <w:rPr>
+                <w:color w:val="1E1B4B"/>
+                <w:spacing w:val="-2"/>
+                <w:sz w:val="18"/>
+              </w:rPr>
+              <w:t>Equipe de dev</w:t>
+            </w:r>
+          </w:p>
+        </w:tc>
+        <w:tc>
+          <w:tcPr>
+            <w:tcW w:w="993" w:type="dxa"/>
+          </w:tcPr>
+          <w:p>
+            <w:pPr>
+              <w:pStyle w:val="TableParagraph"/>
+              <w:spacing w:before="50"/>
+              <w:ind w:left="0"/>
+              <w:jc w:val="center"/>
+              <w:rPr>
+                <w:i/>
+                <w:sz w:val="20"/>
+              </w:rPr>
+            </w:pPr>
+            <w:r>
+              <w:rPr>
+                <w:i/>
+                <w:sz w:val="20"/>
+              </w:rPr>
+              <w:t>SHOULD</w:t>
+            </w:r>
+          </w:p>
+        </w:tc>
+        <w:tc>
+          <w:tcPr>
+            <w:tcW w:w="662" w:type="dxa"/>
+          </w:tcPr>
+          <w:p>
+            <w:pPr>
+              <w:pStyle w:val="TableParagraph"/>
+              <w:ind w:left="0" w:right="4"/>
+              <w:jc w:val="right"/>
+              <w:rPr>
+                <w:color w:val="1E1B4B"/>
+                <w:spacing w:val="-5"/>
+                <w:sz w:val="18"/>
+              </w:rPr>
+            </w:pPr>
+            <w:r>
+              <w:rPr>
+                <w:color w:val="1E1B4B"/>
+                <w:spacing w:val="-5"/>
+                <w:sz w:val="18"/>
+              </w:rPr>
+              <w:t>5</w:t>
+            </w:r>
+          </w:p>
+        </w:tc>
+      </w:tr>
+      <w:tr>
+        <w:trPr>
+          <w:trHeight w:val="1319"/>
+        </w:trPr>
+        <w:tc>
+          <w:tcPr>
+            <w:tcW w:w="883" w:type="dxa"/>
+          </w:tcPr>
+          <w:p>
+            <w:pPr>
+              <w:pStyle w:val="TableParagraph"/>
+              <w:ind w:left="37"/>
+              <w:rPr>
+                <w:b/>
+                <w:color w:val="1E1B4B"/>
+                <w:spacing w:val="-2"/>
+                <w:sz w:val="20"/>
+              </w:rPr>
+            </w:pPr>
+            <w:r>
+              <w:rPr>
+                <w:b/>
+                <w:color w:val="1E1B4B"/>
+                <w:spacing w:val="-2"/>
+                <w:sz w:val="20"/>
+              </w:rPr>
+              <w:lastRenderedPageBreak/>
+              <w:t>US-27</w:t>
+            </w:r>
+          </w:p>
+        </w:tc>
+        <w:tc>
+          <w:tcPr>
+            <w:tcW w:w="883" w:type="dxa"/>
+          </w:tcPr>
+          <w:p>
+            <w:pPr>
+              <w:pStyle w:val="TableParagraph"/>
+              <w:rPr>
+                <w:color w:val="1E1B4B"/>
+                <w:sz w:val="18"/>
+              </w:rPr>
+            </w:pPr>
+            <w:r>
+              <w:rPr>
+                <w:color w:val="1E1B4B"/>
+                <w:sz w:val="18"/>
+              </w:rPr>
+              <w:t>EP-06</w:t>
+            </w:r>
+          </w:p>
+        </w:tc>
+        <w:tc>
+          <w:tcPr>
+            <w:tcW w:w="4195" w:type="dxa"/>
+          </w:tcPr>
+          <w:p>
+            <w:pPr>
+              <w:pStyle w:val="TableParagraph"/>
+              <w:spacing w:line="261" w:lineRule="auto"/>
+              <w:ind w:right="173"/>
+              <w:rPr>
+                <w:color w:val="1E1B4B"/>
+                <w:sz w:val="18"/>
+              </w:rPr>
+            </w:pPr>
+            <w:r>
+              <w:rPr>
+                <w:color w:val="1E1B4B"/>
+                <w:sz w:val="18"/>
+              </w:rPr>
+              <w:t>En tant qu'administrateur, je veux enregistrer toutes les demandes d'export des données personnelles dans un journal d'audit, afin de démontrer la conformité au RGPD.</w:t>
+            </w:r>
+          </w:p>
+        </w:tc>
+        <w:tc>
+          <w:tcPr>
+            <w:tcW w:w="1435" w:type="dxa"/>
+          </w:tcPr>
+          <w:p>
+            <w:pPr>
+              <w:pStyle w:val="TableParagraph"/>
+              <w:rPr>
+                <w:color w:val="1E1B4B"/>
+                <w:spacing w:val="-2"/>
+                <w:sz w:val="18"/>
+              </w:rPr>
+            </w:pPr>
+            <w:r>
+              <w:rPr>
+                <w:color w:val="1E1B4B"/>
+                <w:spacing w:val="-2"/>
+                <w:sz w:val="18"/>
+              </w:rPr>
+              <w:t>Administrateur</w:t>
+            </w:r>
+          </w:p>
+        </w:tc>
+        <w:tc>
+          <w:tcPr>
+            <w:tcW w:w="993" w:type="dxa"/>
+          </w:tcPr>
+          <w:p>
+            <w:pPr>
+              <w:pStyle w:val="TableParagraph"/>
+              <w:spacing w:before="50"/>
+              <w:ind w:left="0"/>
+              <w:jc w:val="center"/>
+              <w:rPr>
+                <w:i/>
+                <w:sz w:val="20"/>
+              </w:rPr>
+            </w:pPr>
+            <w:r>
+              <w:rPr>
+                <w:i/>
+                <w:sz w:val="20"/>
+              </w:rPr>
+              <w:t>SHOULD</w:t>
+            </w:r>
+          </w:p>
+        </w:tc>
+        <w:tc>
+          <w:tcPr>
+            <w:tcW w:w="662" w:type="dxa"/>
+          </w:tcPr>
+          <w:p>
+            <w:pPr>
+              <w:pStyle w:val="TableParagraph"/>
+              <w:ind w:left="0" w:right="4"/>
+              <w:jc w:val="right"/>
+              <w:rPr>
+                <w:color w:val="1E1B4B"/>
+                <w:spacing w:val="-5"/>
+                <w:sz w:val="18"/>
+              </w:rPr>
+            </w:pPr>
+            <w:r>
+              <w:rPr>
+                <w:color w:val="1E1B4B"/>
+                <w:spacing w:val="-5"/>
+                <w:sz w:val="18"/>
+              </w:rPr>
+              <w:t>3</w:t>
             </w:r>
           </w:p>
         </w:tc>
@@ -12519,6 +13255,8 @@
               <w:pStyle w:val="TableParagraph"/>
               <w:spacing w:before="20"/>
               <w:rPr>
+                <w:color w:val="1E1B4B"/>
+                <w:spacing w:val="2"/>
                 <w:sz w:val="18"/>
               </w:rPr>
             </w:pPr>
@@ -12542,160 +13280,127 @@
             <w:r>
               <w:rPr>
                 <w:color w:val="1E1B4B"/>
-                <w:sz w:val="18"/>
-              </w:rPr>
-              <w:t>10</w:t>
-            </w:r>
-            <w:r>
-              <w:rPr>
-                <w:color w:val="1E1B4B"/>
-                <w:spacing w:val="3"/>
+                <w:spacing w:val="2"/>
+                <w:sz w:val="18"/>
+              </w:rPr>
+              <w:t>10 QCM sont générés en moins de 60 sec</w:t>
+            </w:r>
+            <w:r>
+              <w:rPr>
+                <w:color w:val="1E1B4B"/>
+                <w:spacing w:val="2"/>
+                <w:sz w:val="18"/>
+              </w:rPr>
+              <w:t>o</w:t>
+            </w:r>
+            <w:r>
+              <w:rPr>
+                <w:color w:val="1E1B4B"/>
+                <w:spacing w:val="2"/>
+                <w:sz w:val="18"/>
+              </w:rPr>
+              <w:t xml:space="preserve">ndes ; </w:t>
+            </w:r>
+          </w:p>
+          <w:p>
+            <w:pPr>
+              <w:pStyle w:val="TableParagraph"/>
+              <w:spacing w:before="20"/>
+              <w:rPr>
+                <w:color w:val="1E1B4B"/>
+                <w:spacing w:val="2"/>
+                <w:sz w:val="18"/>
+              </w:rPr>
+            </w:pPr>
+            <w:proofErr w:type="gramStart"/>
+            <w:r>
+              <w:rPr>
+                <w:color w:val="1E1B4B"/>
+                <w:spacing w:val="2"/>
+                <w:sz w:val="18"/>
+              </w:rPr>
+              <w:t>le</w:t>
+            </w:r>
+            <w:proofErr w:type="gramEnd"/>
+            <w:r>
+              <w:rPr>
+                <w:color w:val="1E1B4B"/>
+                <w:spacing w:val="2"/>
+                <w:sz w:val="18"/>
+              </w:rPr>
+              <w:t xml:space="preserve"> contenu du cours est traité uniquement comme une donnée utilisateur ; </w:t>
+            </w:r>
+          </w:p>
+          <w:p>
+            <w:pPr>
+              <w:pStyle w:val="TableParagraph"/>
+              <w:spacing w:before="20"/>
+              <w:rPr>
+                <w:color w:val="1E1B4B"/>
+                <w:spacing w:val="2"/>
+                <w:sz w:val="18"/>
+              </w:rPr>
+            </w:pPr>
+            <w:r>
+              <w:rPr>
+                <w:color w:val="1E1B4B"/>
+                <w:spacing w:val="2"/>
                 <w:sz w:val="18"/>
               </w:rPr>
               <w:t xml:space="preserve"> </w:t>
             </w:r>
-            <w:r>
-              <w:rPr>
-                <w:color w:val="1E1B4B"/>
-                <w:sz w:val="18"/>
-              </w:rPr>
-              <w:t>QCM générés</w:t>
-            </w:r>
-            <w:r>
-              <w:rPr>
-                <w:color w:val="1E1B4B"/>
-                <w:spacing w:val="4"/>
+            <w:proofErr w:type="gramStart"/>
+            <w:r>
+              <w:rPr>
+                <w:color w:val="1E1B4B"/>
+                <w:spacing w:val="2"/>
+                <w:sz w:val="18"/>
+              </w:rPr>
+              <w:t>toute</w:t>
+            </w:r>
+            <w:proofErr w:type="gramEnd"/>
+            <w:r>
+              <w:rPr>
+                <w:color w:val="1E1B4B"/>
+                <w:spacing w:val="2"/>
+                <w:sz w:val="18"/>
+              </w:rPr>
+              <w:t xml:space="preserve"> tentative de Prompt Injection est ignorée ; </w:t>
+            </w:r>
+          </w:p>
+          <w:p>
+            <w:pPr>
+              <w:pStyle w:val="TableParagraph"/>
+              <w:spacing w:before="20"/>
+              <w:rPr>
+                <w:sz w:val="18"/>
+              </w:rPr>
+            </w:pPr>
+            <w:r>
+              <w:rPr>
+                <w:color w:val="1E1B4B"/>
+                <w:spacing w:val="2"/>
                 <w:sz w:val="18"/>
               </w:rPr>
               <w:t xml:space="preserve"> </w:t>
             </w:r>
-            <w:r>
-              <w:rPr>
-                <w:color w:val="1E1B4B"/>
-                <w:sz w:val="18"/>
-              </w:rPr>
-              <w:t>en</w:t>
-            </w:r>
-            <w:r>
-              <w:rPr>
-                <w:color w:val="1E1B4B"/>
-                <w:spacing w:val="3"/>
-                <w:sz w:val="18"/>
-              </w:rPr>
-              <w:t xml:space="preserve"> </w:t>
-            </w:r>
-            <w:r>
-              <w:rPr>
-                <w:color w:val="1E1B4B"/>
-                <w:sz w:val="18"/>
-              </w:rPr>
-              <w:t>&lt;</w:t>
-            </w:r>
-            <w:r>
-              <w:rPr>
-                <w:color w:val="1E1B4B"/>
-                <w:spacing w:val="4"/>
-                <w:sz w:val="18"/>
-              </w:rPr>
-              <w:t xml:space="preserve"> </w:t>
-            </w:r>
-            <w:r>
-              <w:rPr>
-                <w:color w:val="1E1B4B"/>
-                <w:sz w:val="18"/>
-              </w:rPr>
-              <w:t>60</w:t>
-            </w:r>
+            <w:proofErr w:type="gramStart"/>
             <w:r>
               <w:rPr>
                 <w:color w:val="1E1B4B"/>
                 <w:spacing w:val="2"/>
                 <w:sz w:val="18"/>
               </w:rPr>
-              <w:t xml:space="preserve"> </w:t>
-            </w:r>
-            <w:r>
-              <w:rPr>
-                <w:color w:val="1E1B4B"/>
-                <w:sz w:val="18"/>
-              </w:rPr>
-              <w:t>s</w:t>
-            </w:r>
-            <w:r>
-              <w:rPr>
-                <w:color w:val="1E1B4B"/>
-                <w:spacing w:val="4"/>
-                <w:sz w:val="18"/>
-              </w:rPr>
-              <w:t xml:space="preserve"> </w:t>
-            </w:r>
-            <w:r>
-              <w:rPr>
-                <w:color w:val="1E1B4B"/>
-                <w:sz w:val="18"/>
-              </w:rPr>
-              <w:t>via</w:t>
-            </w:r>
+              <w:t>le</w:t>
+            </w:r>
+            <w:proofErr w:type="gramEnd"/>
             <w:r>
               <w:rPr>
                 <w:color w:val="1E1B4B"/>
                 <w:spacing w:val="2"/>
                 <w:sz w:val="18"/>
               </w:rPr>
-              <w:t xml:space="preserve"> </w:t>
-            </w:r>
-            <w:r>
-              <w:rPr>
-                <w:color w:val="1E1B4B"/>
-                <w:sz w:val="18"/>
-              </w:rPr>
-              <w:t>Llama</w:t>
-            </w:r>
-            <w:r>
-              <w:rPr>
-                <w:color w:val="1E1B4B"/>
-                <w:spacing w:val="3"/>
-                <w:sz w:val="18"/>
-              </w:rPr>
-              <w:t xml:space="preserve"> </w:t>
-            </w:r>
-            <w:r>
-              <w:rPr>
-                <w:color w:val="1E1B4B"/>
-                <w:sz w:val="18"/>
-              </w:rPr>
-              <w:t>3.1</w:t>
-            </w:r>
-            <w:r>
-              <w:rPr>
-                <w:color w:val="1E1B4B"/>
-                <w:spacing w:val="2"/>
-                <w:sz w:val="18"/>
-              </w:rPr>
-              <w:t xml:space="preserve"> </w:t>
-            </w:r>
-            <w:r>
-              <w:rPr>
-                <w:color w:val="1E1B4B"/>
-                <w:sz w:val="18"/>
-              </w:rPr>
-              <w:t>8B</w:t>
-            </w:r>
-            <w:r>
-              <w:rPr>
-                <w:color w:val="1E1B4B"/>
-                <w:spacing w:val="5"/>
-                <w:sz w:val="18"/>
-              </w:rPr>
-              <w:t xml:space="preserve"> </w:t>
-            </w:r>
-            <w:r>
-              <w:rPr>
-                <w:color w:val="1E1B4B"/>
-                <w:spacing w:val="-2"/>
-                <w:sz w:val="18"/>
-              </w:rPr>
-              <w:t>local</w:t>
+              <w:t xml:space="preserve"> quiz respecte le format attendu.</w:t>
             </w:r>
           </w:p>
         </w:tc>
@@ -14615,31 +15320,180 @@
               <w:spacing w:line="261" w:lineRule="auto"/>
               <w:ind w:right="323"/>
               <w:rPr>
-                <w:sz w:val="18"/>
-              </w:rPr>
-            </w:pPr>
-            <w:r>
-              <w:rPr>
-                <w:color w:val="1E1B4B"/>
-                <w:sz w:val="18"/>
-              </w:rPr>
-              <w:t>[1 critère type : bouton export →</w:t>
-            </w:r>
-            <w:r>
-              <w:rPr>
-                <w:color w:val="1E1B4B"/>
-                <w:spacing w:val="-1"/>
-                <w:sz w:val="18"/>
-              </w:rPr>
-              <w:t xml:space="preserve"> </w:t>
-            </w:r>
-            <w:r>
-              <w:rPr>
-                <w:color w:val="1E1B4B"/>
-                <w:sz w:val="18"/>
-              </w:rPr>
-              <w:t xml:space="preserve">ZIP avec </w:t>
-            </w:r>
+                <w:color w:val="1E1B4B"/>
+                <w:sz w:val="18"/>
+              </w:rPr>
+            </w:pPr>
+            <w:r>
+              <w:rPr>
+                <w:color w:val="1E1B4B"/>
+                <w:sz w:val="18"/>
+              </w:rPr>
+              <w:t>G</w:t>
+            </w:r>
+            <w:r>
+              <w:rPr>
+                <w:color w:val="1E1B4B"/>
+                <w:sz w:val="18"/>
+              </w:rPr>
+              <w:t> :</w:t>
+            </w:r>
+            <w:r>
+              <w:rPr>
+                <w:color w:val="1E1B4B"/>
+                <w:sz w:val="18"/>
+              </w:rPr>
+              <w:t xml:space="preserve"> l'utilisateur est authentifié</w:t>
+            </w:r>
+          </w:p>
+          <w:p>
+            <w:pPr>
+              <w:pStyle w:val="TableParagraph"/>
+              <w:spacing w:line="261" w:lineRule="auto"/>
+              <w:ind w:right="323"/>
+              <w:rPr>
+                <w:color w:val="1E1B4B"/>
+                <w:sz w:val="18"/>
+              </w:rPr>
+            </w:pPr>
+            <w:r>
+              <w:rPr>
+                <w:color w:val="1E1B4B"/>
+                <w:sz w:val="18"/>
+              </w:rPr>
+              <w:t>W</w:t>
+            </w:r>
+            <w:r>
+              <w:rPr>
+                <w:color w:val="1E1B4B"/>
+                <w:sz w:val="18"/>
+              </w:rPr>
+              <w:t> :</w:t>
+            </w:r>
+            <w:r>
+              <w:rPr>
+                <w:color w:val="1E1B4B"/>
+                <w:sz w:val="18"/>
+              </w:rPr>
+              <w:t xml:space="preserve"> il clique sur "Exporter mes données"</w:t>
+            </w:r>
+          </w:p>
+          <w:p>
+            <w:pPr>
+              <w:pStyle w:val="TableParagraph"/>
+              <w:spacing w:line="261" w:lineRule="auto"/>
+              <w:ind w:right="323"/>
+              <w:rPr>
+                <w:color w:val="1E1B4B"/>
+                <w:sz w:val="18"/>
+              </w:rPr>
+            </w:pPr>
+            <w:r>
+              <w:rPr>
+                <w:color w:val="1E1B4B"/>
+                <w:sz w:val="18"/>
+              </w:rPr>
+              <w:t>T</w:t>
+            </w:r>
+            <w:r>
+              <w:rPr>
+                <w:color w:val="1E1B4B"/>
+                <w:sz w:val="18"/>
+              </w:rPr>
+              <w:t> :</w:t>
+            </w:r>
+          </w:p>
+          <w:p>
+            <w:pPr>
+              <w:pStyle w:val="TableParagraph"/>
+              <w:spacing w:line="261" w:lineRule="auto"/>
+              <w:ind w:left="720" w:right="323"/>
+              <w:rPr>
+                <w:color w:val="1E1B4B"/>
+                <w:sz w:val="18"/>
+              </w:rPr>
+            </w:pPr>
+            <w:proofErr w:type="gramStart"/>
+            <w:r>
+              <w:rPr>
+                <w:color w:val="1E1B4B"/>
+                <w:sz w:val="18"/>
+              </w:rPr>
+              <w:t>seules</w:t>
+            </w:r>
+            <w:proofErr w:type="gramEnd"/>
+            <w:r>
+              <w:rPr>
+                <w:color w:val="1E1B4B"/>
+                <w:sz w:val="18"/>
+              </w:rPr>
+              <w:t xml:space="preserve"> ses données personnelles sont exportées ; </w:t>
+            </w:r>
+          </w:p>
+          <w:p>
+            <w:pPr>
+              <w:pStyle w:val="TableParagraph"/>
+              <w:spacing w:line="261" w:lineRule="auto"/>
+              <w:ind w:left="720" w:right="323"/>
+              <w:rPr>
+                <w:color w:val="1E1B4B"/>
+                <w:sz w:val="18"/>
+              </w:rPr>
+            </w:pPr>
+            <w:proofErr w:type="gramStart"/>
+            <w:r>
+              <w:rPr>
+                <w:color w:val="1E1B4B"/>
+                <w:sz w:val="18"/>
+              </w:rPr>
+              <w:t>l'export</w:t>
+            </w:r>
+            <w:proofErr w:type="gramEnd"/>
+            <w:r>
+              <w:rPr>
+                <w:color w:val="1E1B4B"/>
+                <w:sz w:val="18"/>
+              </w:rPr>
+              <w:t xml:space="preserve"> est disponible en JSON et CSV ; </w:t>
+            </w:r>
+          </w:p>
+          <w:p>
+            <w:pPr>
+              <w:pStyle w:val="TableParagraph"/>
+              <w:spacing w:line="261" w:lineRule="auto"/>
+              <w:ind w:left="720" w:right="323"/>
+              <w:rPr>
+                <w:color w:val="1E1B4B"/>
+                <w:sz w:val="18"/>
+              </w:rPr>
+            </w:pPr>
+            <w:proofErr w:type="gramStart"/>
+            <w:r>
+              <w:rPr>
+                <w:color w:val="1E1B4B"/>
+                <w:sz w:val="18"/>
+              </w:rPr>
+              <w:t>le</w:t>
+            </w:r>
+            <w:proofErr w:type="gramEnd"/>
+            <w:r>
+              <w:rPr>
+                <w:color w:val="1E1B4B"/>
+                <w:sz w:val="18"/>
+              </w:rPr>
+              <w:t xml:space="preserve"> téléchargement démarre automatiquement ; </w:t>
+            </w:r>
+          </w:p>
+          <w:p>
+            <w:pPr>
+              <w:pStyle w:val="TableParagraph"/>
+              <w:spacing w:line="261" w:lineRule="auto"/>
+              <w:ind w:left="720" w:right="323"/>
+              <w:rPr>
+                <w:color w:val="1E1B4B"/>
+                <w:sz w:val="18"/>
+              </w:rPr>
+            </w:pPr>
             <w:proofErr w:type="spellStart"/>
             <w:proofErr w:type="gramStart"/>
             <w:r>
@@ -14647,7 +15501,7 @@
                 <w:color w:val="1E1B4B"/>
                 <w:sz w:val="18"/>
               </w:rPr>
-              <w:t>quizz.json</w:t>
+              <w:t>l'endpoint</w:t>
             </w:r>
             <w:proofErr w:type="spellEnd"/>
             <w:proofErr w:type="gramEnd"/>
@@ -14656,26 +15510,18 @@
                 <w:color w:val="1E1B4B"/>
                 <w:sz w:val="18"/>
               </w:rPr>
-              <w:t xml:space="preserve"> + reponses.csv + </w:t>
-            </w:r>
-            <w:proofErr w:type="spellStart"/>
-            <w:proofErr w:type="gramStart"/>
-            <w:r>
-              <w:rPr>
-                <w:color w:val="1E1B4B"/>
-                <w:sz w:val="18"/>
-              </w:rPr>
-              <w:t>audit.json</w:t>
-            </w:r>
-            <w:proofErr w:type="spellEnd"/>
-            <w:proofErr w:type="gramEnd"/>
-            <w:r>
-              <w:rPr>
-                <w:color w:val="1E1B4B"/>
-                <w:sz w:val="18"/>
-              </w:rPr>
-              <w:t>]</w:t>
-            </w:r>
+              <w:t xml:space="preserve"> répond avec le code HTTP 200.</w:t>
+            </w:r>
+          </w:p>
+          <w:p>
+            <w:pPr>
+              <w:pStyle w:val="TableParagraph"/>
+              <w:spacing w:line="261" w:lineRule="auto"/>
+              <w:ind w:right="323"/>
+              <w:rPr>
+                <w:sz w:val="18"/>
+              </w:rPr>
+            </w:pPr>
           </w:p>
         </w:tc>
         <w:tc>
@@ -21477,6 +22323,39 @@
           <w:spacing w:val="-2"/>
         </w:rPr>
         <w:t>vert)</w:t>
+      </w:r>
+    </w:p>
+    <w:p>
+      <w:pPr>
+        <w:pStyle w:val="ListParagraph"/>
+        <w:numPr>
+          <w:ilvl w:val="0"/>
+          <w:numId w:val="4"/>
+        </w:numPr>
+        <w:tabs>
+          <w:tab w:val="left" w:pos="589"/>
+        </w:tabs>
+        <w:ind w:hanging="181"/>
+      </w:pPr>
+      <w:r>
+        <w:rPr>
+          <w:color w:val="1E1B4B"/>
+        </w:rPr>
+        <w:t xml:space="preserve">Les tests </w:t>
+      </w:r>
+      <w:proofErr w:type="spellStart"/>
+      <w:r>
+        <w:rPr>
+          <w:color w:val="1E1B4B"/>
+        </w:rPr>
+        <w:t>adversariaux</w:t>
+      </w:r>
+      <w:proofErr w:type="spellEnd"/>
+      <w:r>
+        <w:rPr>
+          <w:color w:val="1E1B4B"/>
+        </w:rPr>
+        <w:t xml:space="preserve"> de sécurité passent dans GitHub Actions.</w:t>
       </w:r>
     </w:p>
     <w:p>
@@ -23803,6 +24682,155 @@
     </w:lvl>
   </w:abstractNum>
   <w:abstractNum w:abstractNumId="3" w15:restartNumberingAfterBreak="0">
+    <w:nsid w:val="69925922"/>
+    <w:multiLevelType w:val="multilevel"/>
+    <w:tmpl w:val="5C8E3A8A"/>
+    <w:lvl w:ilvl="0">
+      <w:start w:val="1"/>
+      <w:numFmt w:val="bullet"/>
+      <w:lvlText w:val=""/>
+      <w:lvlJc w:val="left"/>
+      <w:pPr>
+        <w:tabs>
+          <w:tab w:val="num" w:pos="720"/>
+        </w:tabs>
+        <w:ind w:left="720" w:hanging="360"/>
+      </w:pPr>
+      <w:rPr>
+        <w:rFonts w:ascii="Symbol" w:hAnsi="Symbol" w:hint="default"/>
+        <w:sz w:val="20"/>
+      </w:rPr>
+    </w:lvl>
+    <w:lvl w:ilvl="1" w:tentative="1">
+      <w:start w:val="1"/>
+      <w:numFmt w:val="bullet"/>
+      <w:lvlText w:val="o"/>
+      <w:lvlJc w:val="left"/>
+      <w:pPr>
+        <w:tabs>
+          <w:tab w:val="num" w:pos="1440"/>
+        </w:tabs>
+        <w:ind w:left="1440" w:hanging="360"/>
+      </w:pPr>
+      <w:rPr>
+        <w:rFonts w:ascii="Courier New" w:hAnsi="Courier New" w:hint="default"/>
+        <w:sz w:val="20"/>
+      </w:rPr>
+    </w:lvl>
+    <w:lvl w:ilvl="2" w:tentative="1">
+      <w:start w:val="1"/>
+      <w:numFmt w:val="bullet"/>
+      <w:lvlText w:val=""/>
+      <w:lvlJc w:val="left"/>
+      <w:pPr>
+        <w:tabs>
+          <w:tab w:val="num" w:pos="2160"/>
+        </w:tabs>
+        <w:ind w:left="2160" w:hanging="360"/>
+      </w:pPr>
+      <w:rPr>
+        <w:rFonts w:ascii="Wingdings" w:hAnsi="Wingdings" w:hint="default"/>
+        <w:sz w:val="20"/>
+      </w:rPr>
+    </w:lvl>
+    <w:lvl w:ilvl="3" w:tentative="1">
+      <w:start w:val="1"/>
+      <w:numFmt w:val="bullet"/>
+      <w:lvlText w:val=""/>
+      <w:lvlJc w:val="left"/>
+      <w:pPr>
+        <w:tabs>
+          <w:tab w:val="num" w:pos="2880"/>
+        </w:tabs>
+        <w:ind w:left="2880" w:hanging="360"/>
+      </w:pPr>
+      <w:rPr>
+        <w:rFonts w:ascii="Wingdings" w:hAnsi="Wingdings" w:hint="default"/>
+        <w:sz w:val="20"/>
+      </w:rPr>
+    </w:lvl>
+    <w:lvl w:ilvl="4" w:tentative="1">
+      <w:start w:val="1"/>
+      <w:numFmt w:val="bullet"/>
+      <w:lvlText w:val=""/>
+      <w:lvlJc w:val="left"/>
+      <w:pPr>
+        <w:tabs>
+          <w:tab w:val="num" w:pos="3600"/>
+        </w:tabs>
+        <w:ind w:left="3600" w:hanging="360"/>
+      </w:pPr>
+      <w:rPr>
+        <w:rFonts w:ascii="Wingdings" w:hAnsi="Wingdings" w:hint="default"/>
+        <w:sz w:val="20"/>
+      </w:rPr>
+    </w:lvl>
+    <w:lvl w:ilvl="5" w:tentative="1">
+      <w:start w:val="1"/>
+      <w:numFmt w:val="bullet"/>
+      <w:lvlText w:val=""/>
+      <w:lvlJc w:val="left"/>
+      <w:pPr>
+        <w:tabs>
+          <w:tab w:val="num" w:pos="4320"/>
+        </w:tabs>
+        <w:ind w:left="4320" w:hanging="360"/>
+      </w:pPr>
+      <w:rPr>
+        <w:rFonts w:ascii="Wingdings" w:hAnsi="Wingdings" w:hint="default"/>
+        <w:sz w:val="20"/>
+      </w:rPr>
+    </w:lvl>
+    <w:lvl w:ilvl="6" w:tentative="1">
+      <w:start w:val="1"/>
+      <w:numFmt w:val="bullet"/>
+      <w:lvlText w:val=""/>
+      <w:lvlJc w:val="left"/>
+      <w:pPr>
+        <w:tabs>
+          <w:tab w:val="num" w:pos="5040"/>
+        </w:tabs>
+        <w:ind w:left="5040" w:hanging="360"/>
+      </w:pPr>
+      <w:rPr>
+        <w:rFonts w:ascii="Wingdings" w:hAnsi="Wingdings" w:hint="default"/>
+        <w:sz w:val="20"/>
+      </w:rPr>
+    </w:lvl>
+    <w:lvl w:ilvl="7" w:tentative="1">
+      <w:start w:val="1"/>
+      <w:numFmt w:val="bullet"/>
+      <w:lvlText w:val=""/>
+      <w:lvlJc w:val="left"/>
+      <w:pPr>
+        <w:tabs>
+          <w:tab w:val="num" w:pos="5760"/>
+        </w:tabs>
+        <w:ind w:left="5760" w:hanging="360"/>
+      </w:pPr>
+      <w:rPr>
+        <w:rFonts w:ascii="Wingdings" w:hAnsi="Wingdings" w:hint="default"/>
+        <w:sz w:val="20"/>
+      </w:rPr>
+    </w:lvl>
+    <w:lvl w:ilvl="8" w:tentative="1">
+      <w:start w:val="1"/>
+      <w:numFmt w:val="bullet"/>
+      <w:lvlText w:val=""/>
+      <w:lvlJc w:val="left"/>
+      <w:pPr>
+        <w:tabs>
+          <w:tab w:val="num" w:pos="6480"/>
+        </w:tabs>
+        <w:ind w:left="6480" w:hanging="360"/>
+      </w:pPr>
+      <w:rPr>
+        <w:rFonts w:ascii="Wingdings" w:hAnsi="Wingdings" w:hint="default"/>
+        <w:sz w:val="20"/>
+      </w:rPr>
+    </w:lvl>
+  </w:abstractNum>
+  <w:abstractNum w:abstractNumId="4" w15:restartNumberingAfterBreak="0">
     <w:nsid w:val="73611143"/>
     <w:multiLevelType w:val="hybridMultilevel"/>
     <w:tmpl w:val="EEE460AC"/>
@@ -23928,13 +24956,16 @@
     <w:abstractNumId w:val="2"/>
   </w:num>
   <w:num w:numId="2" w16cid:durableId="1370759486">
-    <w:abstractNumId w:val="3"/>
+    <w:abstractNumId w:val="4"/>
   </w:num>
   <w:num w:numId="3" w16cid:durableId="89786221">
     <w:abstractNumId w:val="1"/>
   </w:num>
   <w:num w:numId="4" w16cid:durableId="1564370814">
     <w:abstractNumId w:val="0"/>
+  </w:num>
+  <w:num w:numId="5" w16cid:durableId="669990409">
+    <w:abstractNumId w:val="3"/>
   </w:num>
 </w:numbering>
 </file>

</xml_diff>